<commit_message>
Reword Pattern 2 use: 'highlights how rare or unusual something is' (clearer for students)
</commit_message>
<xml_diff>
--- a/Grammar_Lesson_2_Inversions_Student_v2.docx
+++ b/Grammar_Lesson_2_Inversions_Student_v2.docx
@@ -699,11 +699,9 @@
             <w:r>
               <w:rPr>
                 <w:rFonts w:ascii="Times New Roman" w:hAnsi="Times New Roman"/>
-                <w:b w:val="0"/>
-                <w:i w:val="0"/>
                 <w:sz w:val="22"/>
               </w:rPr>
-              <w:t>Turns a criticism or a surprising claim into a formal, striking opening.</w:t>
+              <w:t>Highlights how rare or unusual something is — makes a criticism or a claim sound stronger and more formal.</w:t>
             </w:r>
           </w:p>
         </w:tc>

</xml_diff>